<commit_message>
docs(evaluation): use functional title and formal report language
</commit_message>
<xml_diff>
--- a/docs/evaluation/VinSOC_Mentor_System_Report_2026-10-15.docx
+++ b/docs/evaluation/VinSOC_Mentor_System_Report_2026-10-15.docx
@@ -18,7 +18,7 @@
         <w:pStyle w:val="Title"/>
       </w:pPr>
       <w:r>
-        <w:t>Báo cáo hệ thống VinSOC</w:t>
+        <w:t>Trợ lý điều tra SOC dựa trên bằng chứng</w:t>
       </w:r>
     </w:p>
     <w:p>
@@ -423,7 +423,7 @@
         <w:pStyle w:val="Heading2"/>
       </w:pPr>
       <w:r>
-        <w:t>Triage hiện tại làm gì</w:t>
+        <w:t>Cơ chế triage hiện tại</w:t>
       </w:r>
     </w:p>
     <w:p>
@@ -433,7 +433,7 @@
     </w:p>
     <w:p>
       <w:r>
-        <w:t>Nếu nhãn ban đầu là benign và có human review, hệ thống hỏi người phân tích có đóng cảnh báo hay tiếp tục điều tra. Khi không cấu hình human review, nhánh cũ vẫn có thể tự đóng trước enrichment. Vì vậy, nhận xét của mentor về việc triage quá sớm là có cơ sở; các công cụ điều tra đã có chưa giải quyết hoàn toàn điểm này.</w:t>
+        <w:t>Nếu nhãn ban đầu là benign và có human review, hệ thống hỏi người phân tích có đóng cảnh báo hay tiếp tục điều tra. Khi không cấu hình human review, nhánh cũ vẫn có thể tự đóng trước enrichment. Việc kết luận từ nội dung cảnh báo trước khi thu thập bằng chứng làm hạn chế chất lượng điều tra. Các công cụ phân tích ở bước sau chưa khắc phục nhánh đóng sớm này.</w:t>
       </w:r>
     </w:p>
     <w:p>
@@ -729,12 +729,12 @@
         <w:pStyle w:val="Heading2"/>
       </w:pPr>
       <w:r>
-        <w:t>Điều kiện để triage đáp ứng yêu cầu mentor</w:t>
+        <w:t>Hạn chế và hướng hoàn thiện triage</w:t>
       </w:r>
     </w:p>
     <w:p>
       <w:r>
-        <w:t>Cần tách tiếp nhận và ưu tiên xử lý khỏi kết luận cuối. Không đóng benign chỉ vì một từ khóa trong cảnh báo. Kết luận cần dựa trên nguồn đã tra và dữ liệu hành vi phù hợp; khi thiếu dữ liệu phải giữ trạng thái chưa đủ bằng chứng. Luồng triage sau enrichment còn là phần cần hoàn thiện, không được tính là đã nghiệm thu chỉ bằng việc sửa mô tả.</w:t>
+        <w:t>Hướng hoàn thiện là tách bước tiếp nhận và ưu tiên xử lý khỏi kết luận cuối. Kết luận benign cần có bằng chứng phù hợp từ các nguồn đã tra và dữ liệu hành vi, thay vì chỉ dựa vào từ khóa. Khi thiếu dữ liệu, hồ sơ cần giữ trạng thái chưa đủ bằng chứng. Việc chuyển triage sang quyết định sau enrichment chưa được hoàn tất trong luồng IOC hiện tại.</w:t>
       </w:r>
     </w:p>
     <w:p>
@@ -1219,6 +1219,7 @@
             <w:pPr>
               <w:keepNext/>
               <w:spacing w:after="20" w:line="250" w:lineRule="auto"/>
+              <w:jc w:val="center"/>
             </w:pPr>
             <w:r>
               <w:rPr>
@@ -1227,7 +1228,7 @@
                 <w:color w:val="FFFFFF"/>
                 <w:sz w:val="20"/>
               </w:rPr>
-              <w:t>Chức năng và đầu vào dễ hiểu</w:t>
+              <w:t>Chức năng và đầu vào</w:t>
             </w:r>
           </w:p>
         </w:tc>
@@ -1624,7 +1625,7 @@
     </w:p>
     <w:p>
       <w:r>
-        <w:t>Các công cụ SOC traces phục vụ luồng thí nghiệm riêng và không phải kết nối trực tiếp đến một SIEM sản xuất. Các adapter dự kiến cho Google SecOps, GTI và SCC hiện là khung tích hợp, chưa được trình bày như dịch vụ đã kết nối vận hành.</w:t>
+        <w:t>Các công cụ SOC traces phục vụ luồng thí nghiệm trên dữ liệu tổng hợp, chưa kết nối trực tiếp đến SIEM sản xuất. Adapter cho Google SecOps, GTI và SCC mới ở dạng khung tích hợp, chưa có kết nối vận hành được xác minh.</w:t>
       </w:r>
     </w:p>
     <w:p>
@@ -2270,7 +2271,7 @@
     </w:p>
     <w:p>
       <w:r>
-        <w:t>Có adapter chưa có nghĩa mọi nguồn đã hoạt động trong mọi demo. Nguồn CTI cần cấu hình và quyền truy cập phù hợp; không có nguồn thì công cụ báo lỗi hoặc thiếu dữ liệu, không tạo kết quả thay thế.</w:t>
+        <w:t>Các nguồn CTI chỉ hoạt động khi đã được cấu hình dữ liệu và quyền truy cập phù hợp. Khi nguồn chưa khả dụng, công cụ trả trạng thái lỗi hoặc thiếu dữ liệu. Các demo hiện có chưa xác minh đồng thời toàn bộ nguồn CTI.</w:t>
       </w:r>
     </w:p>
     <w:p>
@@ -3266,7 +3267,7 @@
         <w:pStyle w:val="Heading1"/>
       </w:pPr>
       <w:r>
-        <w:t>6 R1 kết quả đã đo</w:t>
+        <w:t>6 Kết quả đánh giá R1</w:t>
       </w:r>
     </w:p>
     <w:p>
@@ -3852,7 +3853,7 @@
         <w:pStyle w:val="Heading2"/>
       </w:pPr>
       <w:r>
-        <w:t>Điều đã làm được</w:t>
+        <w:t>Kết quả triển khai</w:t>
       </w:r>
     </w:p>
     <w:p>
@@ -3888,7 +3889,7 @@
         <w:pStyle w:val="Heading1"/>
       </w:pPr>
       <w:r>
-        <w:t>7 R2 kết quả đã đo</w:t>
+        <w:t>7 Kết quả đánh giá R2</w:t>
       </w:r>
     </w:p>
     <w:p>
@@ -4663,7 +4664,7 @@
     </w:p>
     <w:p>
       <w:r>
-        <w:t>Chưa có kết quả đầy đủ 192 record để công bố EX trên evaluation 96 câu. Kiểm ngữ nghĩa bằng các bộ dữ liệu phản ví dụ cũng chưa được đo cho các lượt calibration này; giá trị mặc định trong báo cáo tự động không được coi là kết quả thực nghiệm.</w:t>
+        <w:t>Evaluation 96 câu chưa có đủ 192 record kết quả để tổng hợp Execution Accuracy. Các lượt calibration trên cũng chưa có phép đo ngữ nghĩa bằng dữ liệu phản ví dụ; chỉ số này hiện chưa được xác lập.</w:t>
       </w:r>
     </w:p>
     <w:p>
@@ -4684,7 +4685,7 @@
         <w:pStyle w:val="Heading2"/>
       </w:pPr>
       <w:r>
-        <w:t>Một câu hỏi đi qua hệ thống như thế nào</w:t>
+        <w:t>Luồng xử lý câu hỏi mạng</w:t>
       </w:r>
     </w:p>
     <w:p>
@@ -5195,7 +5196,7 @@
     </w:p>
     <w:p>
       <w:r>
-        <w:t>Hệ thống cũng đã chạy một ca SOC traces bằng API thật: mô hình gọi tìm sự kiện và lấy ngữ cảnh; các công cụ trả không khớp hoặc không có dữ liệu. Báo cáo cuối giữ kết luận chưa đủ bằng chứng, thay vì suy ra benign. Nguồn này là dữ liệu tổng hợp; demo không được trình bày như một sự cố sản xuất thật hay một benchmark C2 đã hoàn tất.</w:t>
+        <w:t>Hệ thống cũng đã chạy một ca SOC traces bằng API thật. Mô hình tìm sự kiện và lấy ngữ cảnh; các công cụ trả không khớp hoặc không có dữ liệu. Kết luận cuối là chưa đủ bằng chứng. Ca này sử dụng dữ liệu tổng hợp, không phản ánh một sự cố sản xuất thực tế. Khả năng xác nhận C2 đầu cuối chưa được đánh giá trên một bộ sự cố riêng.</w:t>
       </w:r>
     </w:p>
     <w:p>
@@ -5216,7 +5217,7 @@
         <w:pStyle w:val="Heading2"/>
       </w:pPr>
       <w:r>
-        <w:t>Những phần đã hình thành</w:t>
+        <w:t>Kết quả triển khai và đánh giá</w:t>
       </w:r>
     </w:p>
     <w:p>

</xml_diff>